<commit_message>
Add "The Next Step" as set challenge 1; move Picture This to Other
- New set challenge #1 "The next step." — use AI to understand a recent
  Neuron paper (Livrizzi, Chang-Weinberg et al. 2026, placebo analgesia;
  fact-checked citation + DOI) and design a follow-up experiment; includes
  an open-access PDF download link, a two-part task, and a bad->better
  prompt demo
- Move Picture This out of the set challenges into Other Challenges
- Featured set challenges are now The Next Step + This is not a drill;
  update menu, Other Challenges grid, sidebar, and Workshop Challenge 1 link
- Update counts (16 total; 14 in Other)
- Update facilitator guide (+ regenerated .docx): run-of-show, which-
  challenges-to-run, bad-prompt demo, sample materials/rubrics now reflect
  the two set challenges; soften residual competition language

Co-Authored-By: Claude Opus 4.8 (1M context) <noreply@anthropic.com>
</commit_message>
<xml_diff>
--- a/_instructor/Love-at-First-Byte-Facilitator-Guide.docx
+++ b/_instructor/Love-at-First-Byte-Facilitator-Guide.docx
@@ -44,7 +44,7 @@
         </w:p>
       </w:sdtContent>
     </w:sdt>
-    <w:bookmarkStart w:id="19" w:name="facilitator-guide"/>
+    <w:bookmarkStart w:id="20" w:name="facilitator-guide"/>
     <w:p>
       <w:pPr>
         <w:pStyle w:val="Heading1"/>
@@ -107,7 +107,55 @@
         <w:pStyle w:val="BodyText"/>
       </w:pPr>
       <w:r>
-        <w:t xml:space="preserve">At a glance: 90 minutes · 2 challenge matches · mixed experience · browser-only (no installs required).</w:t>
+        <w:t xml:space="preserve">At a glance: 90 minutes · 2 collaborative challenges · mixed experience · browser-only for most tools (one challenge benefits from a research-capable tool). The two</w:t>
+      </w:r>
+      <w:r>
+        <w:t xml:space="preserve"> </w:t>
+      </w:r>
+      <w:r>
+        <w:rPr>
+          <w:b/>
+          <w:bCs/>
+        </w:rPr>
+        <w:t xml:space="preserve">set challenges</w:t>
+      </w:r>
+      <w:r>
+        <w:t xml:space="preserve"> </w:t>
+      </w:r>
+      <w:r>
+        <w:t xml:space="preserve">are</w:t>
+      </w:r>
+      <w:r>
+        <w:t xml:space="preserve"> </w:t>
+      </w:r>
+      <w:r>
+        <w:rPr>
+          <w:b/>
+          <w:bCs/>
+        </w:rPr>
+        <w:t xml:space="preserve">The Next Step</w:t>
+      </w:r>
+      <w:r>
+        <w:t xml:space="preserve"> </w:t>
+      </w:r>
+      <w:r>
+        <w:t xml:space="preserve">(Challenge 1) and</w:t>
+      </w:r>
+      <w:r>
+        <w:t xml:space="preserve"> </w:t>
+      </w:r>
+      <w:r>
+        <w:rPr>
+          <w:b/>
+          <w:bCs/>
+        </w:rPr>
+        <w:t xml:space="preserve">This is not a drill.</w:t>
+      </w:r>
+      <w:r>
+        <w:t xml:space="preserve"> </w:t>
+      </w:r>
+      <w:r>
+        <w:t xml:space="preserve">(Challenge 2).</w:t>
       </w:r>
     </w:p>
     <w:p>
@@ -131,7 +179,7 @@
         <w:pStyle w:val="FirstParagraph"/>
       </w:pPr>
       <w:r>
-        <w:t xml:space="preserve">A tight arc: a fast, inclusive opening, then two challenge matches with built-in buffers so the timing actually closes. The ethics beat and the advanced-model showcase are folded into existing blocks, so there is no extra time to find. Group formation happens</w:t>
+        <w:t xml:space="preserve">A tight arc: a fast, inclusive opening, then two collaborative challenges with built-in buffers so the timing actually closes. The ethics beat and the advanced-model showcase are folded into existing blocks, so there is no extra time to find. Group formation happens</w:t>
       </w:r>
       <w:r>
         <w:t xml:space="preserve"> </w:t>
@@ -229,29 +277,45 @@
           <w:b/>
           <w:bCs/>
         </w:rPr>
-        <w:t xml:space="preserve">0:20–0:55 — Challenge Match 1 (35 min).</w:t>
-      </w:r>
-      <w:r>
-        <w:t xml:space="preserve"> </w:t>
-      </w:r>
-      <w:r>
-        <w:t xml:space="preserve">Recommended core pick:</w:t>
-      </w:r>
-      <w:r>
-        <w:t xml:space="preserve"> </w:t>
-      </w:r>
-      <w:r>
-        <w:rPr>
+        <w:t xml:space="preserve">0:20–0:55 — Challenge 1 (35 min):</w:t>
+      </w:r>
+      <w:r>
+        <w:rPr>
+          <w:b/>
+          <w:bCs/>
+        </w:rPr>
+        <w:t xml:space="preserve"> </w:t>
+      </w:r>
+      <w:r>
+        <w:rPr>
+          <w:b/>
+          <w:bCs/>
           <w:i/>
           <w:iCs/>
         </w:rPr>
-        <w:t xml:space="preserve">Picture This</w:t>
-      </w:r>
-      <w:r>
-        <w:t xml:space="preserve"> </w:t>
-      </w:r>
-      <w:r>
-        <w:t xml:space="preserve">(visual, immediate payoff, no domain knowledge required). Run it on the per-challenge timeline below.</w:t>
+        <w:t xml:space="preserve">The Next Step.</w:t>
+      </w:r>
+      <w:r>
+        <w:t xml:space="preserve"> </w:t>
+      </w:r>
+      <w:r>
+        <w:t xml:space="preserve">Set challenge — use AI to rapidly understand a complex recent paper (Livrizzi, Chang-Weinberg et al.,</w:t>
+      </w:r>
+      <w:r>
+        <w:t xml:space="preserve"> </w:t>
+      </w:r>
+      <w:r>
+        <w:rPr>
+          <w:i/>
+          <w:iCs/>
+        </w:rPr>
+        <w:t xml:space="preserve">Neuron</w:t>
+      </w:r>
+      <w:r>
+        <w:t xml:space="preserve"> </w:t>
+      </w:r>
+      <w:r>
+        <w:t xml:space="preserve">2026, on placebo analgesia), build a usable explainer, and propose one follow-up experiment. Have the PDF ready to share. Run it on the per-challenge timeline below.</w:t>
       </w:r>
     </w:p>
     <w:p>
@@ -267,41 +331,29 @@
           <w:b/>
           <w:bCs/>
         </w:rPr>
-        <w:t xml:space="preserve">0:55–1:30 — Challenge Match 2 (35 min).</w:t>
-      </w:r>
-      <w:r>
-        <w:t xml:space="preserve"> </w:t>
-      </w:r>
-      <w:r>
-        <w:t xml:space="preserve">Recommended core pick:</w:t>
-      </w:r>
-      <w:r>
-        <w:t xml:space="preserve"> </w:t>
-      </w:r>
-      <w:r>
-        <w:rPr>
+        <w:t xml:space="preserve">0:55–1:30 — Challenge 2 (35 min):</w:t>
+      </w:r>
+      <w:r>
+        <w:rPr>
+          <w:b/>
+          <w:bCs/>
+        </w:rPr>
+        <w:t xml:space="preserve"> </w:t>
+      </w:r>
+      <w:r>
+        <w:rPr>
+          <w:b/>
+          <w:bCs/>
           <w:i/>
           <w:iCs/>
         </w:rPr>
-        <w:t xml:space="preserve">Plain-Language Gauntlet</w:t>
-      </w:r>
-      <w:r>
-        <w:t xml:space="preserve"> </w:t>
-      </w:r>
-      <w:r>
-        <w:t xml:space="preserve">(no code, universally relevant). Same timeline; the debrief pivots to</w:t>
-      </w:r>
-      <w:r>
-        <w:t xml:space="preserve"> </w:t>
-      </w:r>
-      <w:r>
-        <w:t xml:space="preserve">“which AI handled this best, and why.”</w:t>
-      </w:r>
-      <w:r>
-        <w:t xml:space="preserve"> </w:t>
-      </w:r>
-      <w:r>
-        <w:t xml:space="preserve">Reserve the last two minutes for the ethics moment and one</w:t>
+        <w:t xml:space="preserve">This is not a drill.</w:t>
+      </w:r>
+      <w:r>
+        <w:t xml:space="preserve"> </w:t>
+      </w:r>
+      <w:r>
+        <w:t xml:space="preserve">Set challenge — use AI to understand a live federal rule change (OMB’s proposed rule, 91 FR 32198) and draft a substantive public comment before the July 13, 2026 deadline. Same timeline; the debrief turns to what made comments impactful and what each tool did well. Reserve the last two minutes for the ethics moment and one</w:t>
       </w:r>
       <w:r>
         <w:t xml:space="preserve"> </w:t>
@@ -440,7 +492,7 @@
         <w:t xml:space="preserve"> </w:t>
       </w:r>
       <w:r>
-        <w:t xml:space="preserve">Rotate tool assignments, swap stimulus materials, reset. Match 2 starts on time.</w:t>
+        <w:t xml:space="preserve">Rotate tool assignments, swap stimulus materials, reset. Challenge 2 starts on time.</w:t>
       </w:r>
     </w:p>
     <w:p>
@@ -465,7 +517,23 @@
         <w:pStyle w:val="FirstParagraph"/>
       </w:pPr>
       <w:r>
-        <w:t xml:space="preserve">If you only run two challenges, run the first two below. The third is a strong backup if a table finishes early or a tool misbehaves.</w:t>
+        <w:t xml:space="preserve">The two</w:t>
+      </w:r>
+      <w:r>
+        <w:t xml:space="preserve"> </w:t>
+      </w:r>
+      <w:r>
+        <w:rPr>
+          <w:b/>
+          <w:bCs/>
+        </w:rPr>
+        <w:t xml:space="preserve">set challenges</w:t>
+      </w:r>
+      <w:r>
+        <w:t xml:space="preserve"> </w:t>
+      </w:r>
+      <w:r>
+        <w:t xml:space="preserve">are fixed:</w:t>
       </w:r>
     </w:p>
     <w:p>
@@ -481,13 +549,29 @@
           <w:b/>
           <w:bCs/>
         </w:rPr>
-        <w:t xml:space="preserve">Picture This (core).</w:t>
-      </w:r>
-      <w:r>
-        <w:t xml:space="preserve"> </w:t>
-      </w:r>
-      <w:r>
-        <w:t xml:space="preserve">Rescue an ugly data table — turn a messy export into a figure that actually communicates. Visual, immediate payoff, no domain knowledge required.</w:t>
+        <w:t xml:space="preserve">Challenge 1 — The Next Step.</w:t>
+      </w:r>
+      <w:r>
+        <w:t xml:space="preserve"> </w:t>
+      </w:r>
+      <w:r>
+        <w:t xml:space="preserve">Use AI to understand a complex recent paper (Livrizzi, Chang-Weinberg et al.,</w:t>
+      </w:r>
+      <w:r>
+        <w:t xml:space="preserve"> </w:t>
+      </w:r>
+      <w:r>
+        <w:rPr>
+          <w:i/>
+          <w:iCs/>
+        </w:rPr>
+        <w:t xml:space="preserve">Neuron</w:t>
+      </w:r>
+      <w:r>
+        <w:t xml:space="preserve"> </w:t>
+      </w:r>
+      <w:r>
+        <w:t xml:space="preserve">2026) and propose a follow-up experiment. Have the open-access PDF ready to hand out. Any chat AI that accepts a PDF works; a research-capable tool helps with the novelty check in Part 2.</w:t>
       </w:r>
     </w:p>
     <w:p>
@@ -503,35 +587,85 @@
           <w:b/>
           <w:bCs/>
         </w:rPr>
-        <w:t xml:space="preserve">Plain-Language Gauntlet (core).</w:t>
-      </w:r>
-      <w:r>
-        <w:t xml:space="preserve"> </w:t>
-      </w:r>
-      <w:r>
-        <w:t xml:space="preserve">One dense paragraph, three audiences — translate without distorting. No code, universally relevant.</w:t>
-      </w:r>
-    </w:p>
-    <w:p>
-      <w:pPr>
-        <w:pStyle w:val="Compact"/>
-        <w:numPr>
-          <w:ilvl w:val="0"/>
-          <w:numId w:val="1003"/>
-        </w:numPr>
-      </w:pPr>
-      <w:r>
-        <w:rPr>
-          <w:b/>
-          <w:bCs/>
-        </w:rPr>
-        <w:t xml:space="preserve">Hypothesis Roulette (backup).</w:t>
-      </w:r>
-      <w:r>
-        <w:t xml:space="preserve"> </w:t>
-      </w:r>
-      <w:r>
-        <w:t xml:space="preserve">Five mechanistic hypotheses from a single surprising null result. Slightly more domain-dependent; best if the room is research-experienced.</w:t>
+        <w:t xml:space="preserve">Challenge 2 — This is not a drill.</w:t>
+      </w:r>
+      <w:r>
+        <w:t xml:space="preserve"> </w:t>
+      </w:r>
+      <w:r>
+        <w:t xml:space="preserve">Use AI to understand OMB’s live proposed grants rule (91 FR 32198) and draft a substantive public comment before the July 13, 2026 deadline. A research-capable tool helps; the page links the rule and a hints page.</w:t>
+      </w:r>
+    </w:p>
+    <w:p>
+      <w:pPr>
+        <w:pStyle w:val="FirstParagraph"/>
+      </w:pPr>
+      <w:r>
+        <w:t xml:space="preserve">If you need a gentler or shorter alternate (a table finishes early, a tool misbehaves, or the room is AI-shy), good swaps from</w:t>
+      </w:r>
+      <w:r>
+        <w:t xml:space="preserve"> </w:t>
+      </w:r>
+      <w:r>
+        <w:rPr>
+          <w:b/>
+          <w:bCs/>
+        </w:rPr>
+        <w:t xml:space="preserve">Other Challenges</w:t>
+      </w:r>
+      <w:r>
+        <w:t xml:space="preserve"> </w:t>
+      </w:r>
+      <w:r>
+        <w:t xml:space="preserve">are</w:t>
+      </w:r>
+      <w:r>
+        <w:t xml:space="preserve"> </w:t>
+      </w:r>
+      <w:r>
+        <w:rPr>
+          <w:b/>
+          <w:bCs/>
+        </w:rPr>
+        <w:t xml:space="preserve">Picture This</w:t>
+      </w:r>
+      <w:r>
+        <w:t xml:space="preserve"> </w:t>
+      </w:r>
+      <w:r>
+        <w:t xml:space="preserve">(visual, instant payoff, no domain knowledge),</w:t>
+      </w:r>
+      <w:r>
+        <w:t xml:space="preserve"> </w:t>
+      </w:r>
+      <w:r>
+        <w:rPr>
+          <w:b/>
+          <w:bCs/>
+        </w:rPr>
+        <w:t xml:space="preserve">Plain-Language Gauntlet</w:t>
+      </w:r>
+      <w:r>
+        <w:t xml:space="preserve"> </w:t>
+      </w:r>
+      <w:r>
+        <w:t xml:space="preserve">(no code, universal), or</w:t>
+      </w:r>
+      <w:r>
+        <w:t xml:space="preserve"> </w:t>
+      </w:r>
+      <w:r>
+        <w:rPr>
+          <w:b/>
+          <w:bCs/>
+        </w:rPr>
+        <w:t xml:space="preserve">Hypothesis Roulette</w:t>
+      </w:r>
+      <w:r>
+        <w:t xml:space="preserve"> </w:t>
+      </w:r>
+      <w:r>
+        <w:t xml:space="preserve">(lively, vote-driven).</w:t>
       </w:r>
     </w:p>
     <w:bookmarkEnd w:id="10"/>
@@ -550,25 +684,7 @@
         <w:pStyle w:val="FirstParagraph"/>
       </w:pPr>
       <w:r>
-        <w:t xml:space="preserve">Open every challenge with it. Spend about two minutes typing a lazy prompt live —</w:t>
-      </w:r>
-      <w:r>
-        <w:t xml:space="preserve"> </w:t>
-      </w:r>
-      <w:r>
-        <w:t xml:space="preserve">“make a graph of this,”</w:t>
-      </w:r>
-      <w:r>
-        <w:t xml:space="preserve"> </w:t>
-      </w:r>
-      <w:r>
-        <w:t xml:space="preserve">“explain this paper”</w:t>
-      </w:r>
-      <w:r>
-        <w:t xml:space="preserve"> </w:t>
-      </w:r>
-      <w:r>
-        <w:t xml:space="preserve">— and show the mediocre result. Do not fix it. The weak output is the point: it makes the task concrete, sets a visible bar, and lowers the intimidation factor for newcomers because the starting line is obviously low.</w:t>
+        <w:t xml:space="preserve">Open every challenge with it. Spend about two minutes typing a lazy prompt live and show the mediocre result. Do not fix it. The weak output is the point: it makes the task concrete, sets a visible bar, and lowers the intimidation factor for newcomers because the starting line is obviously low.</w:t>
       </w:r>
     </w:p>
     <w:p>
@@ -585,38 +701,116 @@
     </w:p>
     <w:p>
       <w:pPr>
+        <w:pStyle w:val="Compact"/>
+        <w:numPr>
+          <w:ilvl w:val="0"/>
+          <w:numId w:val="1004"/>
+        </w:numPr>
+      </w:pPr>
+      <w:r>
+        <w:rPr>
+          <w:i/>
+          <w:iCs/>
+        </w:rPr>
+        <w:t xml:space="preserve">For The Next Step:</w:t>
+      </w:r>
+      <w:r>
+        <w:t xml:space="preserve"> </w:t>
+      </w:r>
+      <w:r>
+        <w:t xml:space="preserve">paste the paper and type</w:t>
+      </w:r>
+      <w:r>
+        <w:t xml:space="preserve"> </w:t>
+      </w:r>
+      <w:r>
+        <w:rPr>
+          <w:b/>
+          <w:bCs/>
+        </w:rPr>
+        <w:t xml:space="preserve">“Summarize this paper.”</w:t>
+      </w:r>
+      <w:r>
+        <w:t xml:space="preserve"> </w:t>
+      </w:r>
+      <w:r>
+        <w:t xml:space="preserve">You’ll get a polished paragraph that mirrors the abstract, skips the techniques, never explains</w:t>
+      </w:r>
+      <w:r>
+        <w:t xml:space="preserve"> </w:t>
+      </w:r>
+      <w:r>
+        <w:rPr>
+          <w:i/>
+          <w:iCs/>
+        </w:rPr>
+        <w:t xml:space="preserve">why</w:t>
+      </w:r>
+      <w:r>
+        <w:t xml:space="preserve"> </w:t>
+      </w:r>
+      <w:r>
+        <w:t xml:space="preserve">each experiment was run, and surfaces none of the assumptions you’d need to design what comes next.</w:t>
+      </w:r>
+    </w:p>
+    <w:p>
+      <w:pPr>
+        <w:pStyle w:val="Compact"/>
+        <w:numPr>
+          <w:ilvl w:val="0"/>
+          <w:numId w:val="1004"/>
+        </w:numPr>
+      </w:pPr>
+      <w:r>
+        <w:rPr>
+          <w:i/>
+          <w:iCs/>
+        </w:rPr>
+        <w:t xml:space="preserve">For This is not a drill:</w:t>
+      </w:r>
+      <w:r>
+        <w:t xml:space="preserve"> </w:t>
+      </w:r>
+      <w:r>
+        <w:rPr>
+          <w:b/>
+          <w:bCs/>
+        </w:rPr>
+        <w:t xml:space="preserve">“Summarize this 108-page rule and write me a public comment opposing it.”</w:t>
+      </w:r>
+      <w:r>
+        <w:t xml:space="preserve"> </w:t>
+      </w:r>
+      <w:r>
+        <w:t xml:space="preserve">You’ll get a vague summary (often with invented or misnumbered sections) and a comment with no docket or section citations, no evidence, and no specific alternative — exactly the kind an agency can wave away as non-substantive.</w:t>
+      </w:r>
+    </w:p>
+    <w:p>
+      <w:pPr>
+        <w:pStyle w:val="FirstParagraph"/>
+      </w:pPr>
+      <w:r>
+        <w:t xml:space="preserve">Resist the urge to improve it on screen.</w:t>
+      </w:r>
+    </w:p>
+    <w:p>
+      <w:pPr>
+        <w:pStyle w:val="BodyText"/>
+      </w:pPr>
+      <w:r>
+        <w:rPr>
+          <w:b/>
+          <w:bCs/>
+        </w:rPr>
+        <w:t xml:space="preserve">The challenge to the room (reusable script):</w:t>
+      </w:r>
+    </w:p>
+    <w:p>
+      <w:pPr>
         <w:pStyle w:val="BlockText"/>
       </w:pPr>
       <w:r>
-        <w:t xml:space="preserve">make a graph of this data</w:t>
-      </w:r>
-    </w:p>
-    <w:p>
-      <w:pPr>
-        <w:pStyle w:val="FirstParagraph"/>
-      </w:pPr>
-      <w:r>
-        <w:t xml:space="preserve">…then paste the messy table and let the tool produce a default, mislabeled, unit-confused chart. Resist the urge to improve it.</w:t>
-      </w:r>
-    </w:p>
-    <w:p>
-      <w:pPr>
-        <w:pStyle w:val="BodyText"/>
-      </w:pPr>
-      <w:r>
-        <w:rPr>
-          <w:b/>
-          <w:bCs/>
-        </w:rPr>
-        <w:t xml:space="preserve">The challenge to the room (reusable script):</w:t>
-      </w:r>
-    </w:p>
-    <w:p>
-      <w:pPr>
-        <w:pStyle w:val="BlockText"/>
-      </w:pPr>
-      <w:r>
-        <w:t xml:space="preserve">“That’s what you get for free, and it isn’t good enough to put in a talk. It guessed the units, dropped a label, and has no idea what story we’re telling. For the next 15 minutes, your job is to beat this — same data, same tool, make something you’d actually show your PI.”</w:t>
+        <w:t xml:space="preserve">“That’s what you get for free, and it isn’t good enough to act on. It skipped the techniques / cited nothing / has no idea what story we’re telling. For the next 15 minutes, your job is to beat this — same source, same tool, make something you’d actually use.”</w:t>
       </w:r>
     </w:p>
     <w:p>
@@ -732,7 +926,7 @@
         <w:pStyle w:val="Compact"/>
         <w:numPr>
           <w:ilvl w:val="0"/>
-          <w:numId w:val="1004"/>
+          <w:numId w:val="1005"/>
         </w:numPr>
       </w:pPr>
       <w:r>
@@ -766,7 +960,7 @@
         <w:pStyle w:val="Compact"/>
         <w:numPr>
           <w:ilvl w:val="0"/>
-          <w:numId w:val="1004"/>
+          <w:numId w:val="1005"/>
         </w:numPr>
       </w:pPr>
       <w:r>
@@ -780,13 +974,13 @@
         <w:t xml:space="preserve"> </w:t>
       </w:r>
       <w:r>
-        <w:t xml:space="preserve">“Which AI handled this best, and why?”</w:t>
-      </w:r>
-      <w:r>
-        <w:t xml:space="preserve"> </w:t>
-      </w:r>
-      <w:r>
-        <w:t xml:space="preserve">Push for specifics: refusals, formatting, citation behavior, code quality, and how each tool handled the deliberate typo or the missing label.</w:t>
+        <w:t xml:space="preserve">“What did each AI do well, and where did it struggle?”</w:t>
+      </w:r>
+      <w:r>
+        <w:t xml:space="preserve"> </w:t>
+      </w:r>
+      <w:r>
+        <w:t xml:space="preserve">Push for specifics: refusals, formatting, citation behavior, how faithfully it described a method, and whether it invented a section number, statistic, or reference.</w:t>
       </w:r>
     </w:p>
     <w:p>
@@ -794,7 +988,7 @@
         <w:pStyle w:val="Compact"/>
         <w:numPr>
           <w:ilvl w:val="0"/>
-          <w:numId w:val="1004"/>
+          <w:numId w:val="1005"/>
         </w:numPr>
       </w:pPr>
       <w:r>
@@ -816,7 +1010,7 @@
         <w:pStyle w:val="Compact"/>
         <w:numPr>
           <w:ilvl w:val="0"/>
-          <w:numId w:val="1004"/>
+          <w:numId w:val="1005"/>
         </w:numPr>
       </w:pPr>
       <w:r>
@@ -887,7 +1081,7 @@
         <w:pStyle w:val="Compact"/>
         <w:numPr>
           <w:ilvl w:val="0"/>
-          <w:numId w:val="1005"/>
+          <w:numId w:val="1006"/>
         </w:numPr>
       </w:pPr>
       <w:r>
@@ -909,7 +1103,7 @@
         <w:pStyle w:val="Compact"/>
         <w:numPr>
           <w:ilvl w:val="0"/>
-          <w:numId w:val="1005"/>
+          <w:numId w:val="1006"/>
         </w:numPr>
       </w:pPr>
       <w:r>
@@ -931,7 +1125,7 @@
         <w:pStyle w:val="Compact"/>
         <w:numPr>
           <w:ilvl w:val="0"/>
-          <w:numId w:val="1005"/>
+          <w:numId w:val="1006"/>
         </w:numPr>
       </w:pPr>
       <w:r>
@@ -1002,7 +1196,7 @@
         <w:t xml:space="preserve">Skip ChatGPT and turn the access constraint into the main event. Assign each breakout a different free tool — Claude, Gemini, Copilot, Perplexity, Meta AI. The same task on several engines makes the debrief a genuine comparison (</w:t>
       </w:r>
       <w:r>
-        <w:t xml:space="preserve">“which AI won, and why”</w:t>
+        <w:t xml:space="preserve">“what did each AI do well, and where did it struggle?”</w:t>
       </w:r>
       <w:r>
         <w:t xml:space="preserve">) rather than several near-identical outputs. Assign tools during the warm-up so no time is lost, and rotate assignments between Match 1 and Match 2 so every group sees two tools. Check logins in advance only where an account is needed; otherwise it is all browser-based.</w:t>
@@ -1016,7 +1210,7 @@
       </w:r>
     </w:p>
     <w:bookmarkEnd w:id="15"/>
-    <w:bookmarkStart w:id="16" w:name="prep-checklist-and-auxiliary-materials"/>
+    <w:bookmarkStart w:id="17" w:name="prep-checklist-and-auxiliary-materials"/>
     <w:p>
       <w:pPr>
         <w:pStyle w:val="Heading2"/>
@@ -1038,7 +1232,7 @@
         <w:pStyle w:val="Compact"/>
         <w:numPr>
           <w:ilvl w:val="0"/>
-          <w:numId w:val="1006"/>
+          <w:numId w:val="1007"/>
         </w:numPr>
       </w:pPr>
       <w:r>
@@ -1060,7 +1254,7 @@
         <w:pStyle w:val="Compact"/>
         <w:numPr>
           <w:ilvl w:val="0"/>
-          <w:numId w:val="1006"/>
+          <w:numId w:val="1007"/>
         </w:numPr>
       </w:pPr>
       <w:r>
@@ -1082,7 +1276,7 @@
         <w:pStyle w:val="Compact"/>
         <w:numPr>
           <w:ilvl w:val="0"/>
-          <w:numId w:val="1006"/>
+          <w:numId w:val="1007"/>
         </w:numPr>
       </w:pPr>
       <w:r>
@@ -1116,7 +1310,7 @@
         <w:pStyle w:val="Compact"/>
         <w:numPr>
           <w:ilvl w:val="0"/>
-          <w:numId w:val="1006"/>
+          <w:numId w:val="1007"/>
         </w:numPr>
       </w:pPr>
       <w:r>
@@ -1132,7 +1326,7 @@
         <w:pStyle w:val="Compact"/>
         <w:numPr>
           <w:ilvl w:val="1"/>
-          <w:numId w:val="1007"/>
+          <w:numId w:val="1008"/>
         </w:numPr>
       </w:pPr>
       <w:r>
@@ -1140,13 +1334,13 @@
           <w:i/>
           <w:iCs/>
         </w:rPr>
-        <w:t xml:space="preserve">Picture This:</w:t>
-      </w:r>
-      <w:r>
-        <w:t xml:space="preserve"> </w:t>
-      </w:r>
-      <w:r>
-        <w:t xml:space="preserve">clarity · correct encoding · accessibility (colorblind-safe, labels) · honesty (no invented data).</w:t>
+        <w:t xml:space="preserve">The Next Step:</w:t>
+      </w:r>
+      <w:r>
+        <w:t xml:space="preserve"> </w:t>
+      </w:r>
+      <w:r>
+        <w:t xml:space="preserve">explainer clarity · technique accuracy (no misdescribed methods) · experiment logic captured · follow-up experiment (tests a real assumption, plausibly novel, feasible).</w:t>
       </w:r>
     </w:p>
     <w:p>
@@ -1154,7 +1348,7 @@
         <w:pStyle w:val="Compact"/>
         <w:numPr>
           <w:ilvl w:val="1"/>
-          <w:numId w:val="1007"/>
+          <w:numId w:val="1008"/>
         </w:numPr>
       </w:pPr>
       <w:r>
@@ -1162,35 +1356,13 @@
           <w:i/>
           <w:iCs/>
         </w:rPr>
-        <w:t xml:space="preserve">Plain-Language Gauntlet:</w:t>
-      </w:r>
-      <w:r>
-        <w:t xml:space="preserve"> </w:t>
-      </w:r>
-      <w:r>
-        <w:t xml:space="preserve">accuracy · jargon-free · right register for the audience · length discipline.</w:t>
-      </w:r>
-    </w:p>
-    <w:p>
-      <w:pPr>
-        <w:pStyle w:val="Compact"/>
-        <w:numPr>
-          <w:ilvl w:val="0"/>
-          <w:numId w:val="1006"/>
-        </w:numPr>
-      </w:pPr>
-      <w:r>
-        <w:rPr>
-          <w:b/>
-          <w:bCs/>
-        </w:rPr>
-        <w:t xml:space="preserve">Sample materials, pre-vetted</w:t>
-      </w:r>
-      <w:r>
-        <w:t xml:space="preserve"> </w:t>
-      </w:r>
-      <w:r>
-        <w:t xml:space="preserve">(so no group spends time hunting inputs, and so the bad-prompt demo is reproducible):</w:t>
+        <w:t xml:space="preserve">This is not a drill:</w:t>
+      </w:r>
+      <w:r>
+        <w:t xml:space="preserve"> </w:t>
+      </w:r>
+      <w:r>
+        <w:t xml:space="preserve">targets a specific provision/section · concrete impact · evidence + a specific alternative · verified (no hallucinated section numbers or dates).</w:t>
       </w:r>
     </w:p>
     <w:p>
@@ -1206,23 +1378,17 @@
           <w:i/>
           <w:iCs/>
         </w:rPr>
-        <w:t xml:space="preserve">Picture This:</w:t>
-      </w:r>
-      <w:r>
-        <w:t xml:space="preserve"> </w:t>
-      </w:r>
-      <w:r>
-        <w:t xml:space="preserve">one deliberately messy data table (inconsistent units, missing labels, a typo), plus a clean version for checking.</w:t>
-      </w:r>
-    </w:p>
-    <w:p>
-      <w:pPr>
-        <w:pStyle w:val="Compact"/>
-        <w:numPr>
-          <w:ilvl w:val="1"/>
-          <w:numId w:val="1008"/>
-        </w:numPr>
-      </w:pPr>
+        <w:t xml:space="preserve">Alternates — Picture This:</w:t>
+      </w:r>
+      <w:r>
+        <w:t xml:space="preserve"> </w:t>
+      </w:r>
+      <w:r>
+        <w:t xml:space="preserve">clarity · correct encoding · accessibility (colorblind-safe, labels) · honesty (no invented data).</w:t>
+      </w:r>
+      <w:r>
+        <w:t xml:space="preserve"> </w:t>
+      </w:r>
       <w:r>
         <w:rPr>
           <w:i/>
@@ -1234,7 +1400,29 @@
         <w:t xml:space="preserve"> </w:t>
       </w:r>
       <w:r>
-        <w:t xml:space="preserve">one dense pain-neuroimaging methods paragraph.</w:t>
+        <w:t xml:space="preserve">accuracy · jargon-free · right register · length discipline.</w:t>
+      </w:r>
+    </w:p>
+    <w:p>
+      <w:pPr>
+        <w:pStyle w:val="Compact"/>
+        <w:numPr>
+          <w:ilvl w:val="0"/>
+          <w:numId w:val="1007"/>
+        </w:numPr>
+      </w:pPr>
+      <w:r>
+        <w:rPr>
+          <w:b/>
+          <w:bCs/>
+        </w:rPr>
+        <w:t xml:space="preserve">Sample materials, pre-vetted</w:t>
+      </w:r>
+      <w:r>
+        <w:t xml:space="preserve"> </w:t>
+      </w:r>
+      <w:r>
+        <w:t xml:space="preserve">(so no group spends time hunting inputs, and so the bad-prompt demo is reproducible):</w:t>
       </w:r>
     </w:p>
     <w:p>
@@ -1242,7 +1430,7 @@
         <w:pStyle w:val="Compact"/>
         <w:numPr>
           <w:ilvl w:val="1"/>
-          <w:numId w:val="1008"/>
+          <w:numId w:val="1009"/>
         </w:numPr>
       </w:pPr>
       <w:r>
@@ -1250,13 +1438,84 @@
           <w:i/>
           <w:iCs/>
         </w:rPr>
-        <w:t xml:space="preserve">Backup (Hypothesis Roulette):</w:t>
-      </w:r>
-      <w:r>
-        <w:t xml:space="preserve"> </w:t>
-      </w:r>
-      <w:r>
-        <w:t xml:space="preserve">one crisp, surprising null result.</w:t>
+        <w:t xml:space="preserve">The Next Step:</w:t>
+      </w:r>
+      <w:r>
+        <w:t xml:space="preserve"> </w:t>
+      </w:r>
+      <w:r>
+        <w:t xml:space="preserve">the open-access paper PDF, ready to hand out or drop into the shared doc —</w:t>
+      </w:r>
+      <w:r>
+        <w:t xml:space="preserve"> </w:t>
+      </w:r>
+      <w:hyperlink r:id="rId16">
+        <w:r>
+          <w:rPr>
+            <w:rStyle w:val="Hyperlink"/>
+          </w:rPr>
+          <w:t xml:space="preserve">download link</w:t>
+        </w:r>
+      </w:hyperlink>
+      <w:r>
+        <w:t xml:space="preserve">. Optionally pre-load it in one AI tool so the demo is instant.</w:t>
+      </w:r>
+    </w:p>
+    <w:p>
+      <w:pPr>
+        <w:pStyle w:val="Compact"/>
+        <w:numPr>
+          <w:ilvl w:val="1"/>
+          <w:numId w:val="1009"/>
+        </w:numPr>
+      </w:pPr>
+      <w:r>
+        <w:rPr>
+          <w:i/>
+          <w:iCs/>
+        </w:rPr>
+        <w:t xml:space="preserve">This is not a drill:</w:t>
+      </w:r>
+      <w:r>
+        <w:t xml:space="preserve"> </w:t>
+      </w:r>
+      <w:r>
+        <w:t xml:space="preserve">the rule link (91 FR 32198) and docket</w:t>
+      </w:r>
+      <w:r>
+        <w:t xml:space="preserve"> </w:t>
+      </w:r>
+      <w:r>
+        <w:rPr>
+          <w:b/>
+          <w:bCs/>
+        </w:rPr>
+        <w:t xml:space="preserve">OMB-2026-0034</w:t>
+      </w:r>
+      <w:r>
+        <w:t xml:space="preserve">, plus the challenge’s hints page for groups that get stuck.</w:t>
+      </w:r>
+    </w:p>
+    <w:p>
+      <w:pPr>
+        <w:pStyle w:val="Compact"/>
+        <w:numPr>
+          <w:ilvl w:val="1"/>
+          <w:numId w:val="1009"/>
+        </w:numPr>
+      </w:pPr>
+      <w:r>
+        <w:rPr>
+          <w:i/>
+          <w:iCs/>
+        </w:rPr>
+        <w:t xml:space="preserve">Alternates:</w:t>
+      </w:r>
+      <w:r>
+        <w:t xml:space="preserve"> </w:t>
+      </w:r>
+      <w:r>
+        <w:t xml:space="preserve">a deliberately messy data table (Picture This), a dense methods paragraph (Plain-Language Gauntlet), or a surprising null result (Hypothesis Roulette).</w:t>
       </w:r>
     </w:p>
     <w:p>
@@ -1264,7 +1523,7 @@
         <w:pStyle w:val="Compact"/>
         <w:numPr>
           <w:ilvl w:val="0"/>
-          <w:numId w:val="1006"/>
+          <w:numId w:val="1007"/>
         </w:numPr>
       </w:pPr>
       <w:r>
@@ -1286,7 +1545,7 @@
         <w:pStyle w:val="Compact"/>
         <w:numPr>
           <w:ilvl w:val="0"/>
-          <w:numId w:val="1006"/>
+          <w:numId w:val="1007"/>
         </w:numPr>
       </w:pPr>
       <w:r>
@@ -1308,7 +1567,7 @@
         <w:pStyle w:val="Compact"/>
         <w:numPr>
           <w:ilvl w:val="0"/>
-          <w:numId w:val="1006"/>
+          <w:numId w:val="1007"/>
         </w:numPr>
       </w:pPr>
       <w:r>
@@ -1332,8 +1591,8 @@
         </w:pict>
       </w:r>
     </w:p>
-    <w:bookmarkEnd w:id="16"/>
-    <w:bookmarkStart w:id="17" w:name="suggested-improvements-and-alternatives"/>
+    <w:bookmarkEnd w:id="17"/>
+    <w:bookmarkStart w:id="18" w:name="suggested-improvements-and-alternatives"/>
     <w:p>
       <w:pPr>
         <w:pStyle w:val="Heading2"/>
@@ -1355,7 +1614,7 @@
         <w:pStyle w:val="Compact"/>
         <w:numPr>
           <w:ilvl w:val="0"/>
-          <w:numId w:val="1009"/>
+          <w:numId w:val="1010"/>
         </w:numPr>
       </w:pPr>
       <w:r>
@@ -1389,7 +1648,7 @@
         <w:pStyle w:val="Compact"/>
         <w:numPr>
           <w:ilvl w:val="0"/>
-          <w:numId w:val="1009"/>
+          <w:numId w:val="1010"/>
         </w:numPr>
       </w:pPr>
       <w:r>
@@ -1411,7 +1670,7 @@
         <w:pStyle w:val="Compact"/>
         <w:numPr>
           <w:ilvl w:val="0"/>
-          <w:numId w:val="1009"/>
+          <w:numId w:val="1010"/>
         </w:numPr>
       </w:pPr>
       <w:r>
@@ -1433,7 +1692,7 @@
         <w:pStyle w:val="Compact"/>
         <w:numPr>
           <w:ilvl w:val="0"/>
-          <w:numId w:val="1009"/>
+          <w:numId w:val="1010"/>
         </w:numPr>
       </w:pPr>
       <w:r>
@@ -1455,7 +1714,7 @@
         <w:pStyle w:val="Compact"/>
         <w:numPr>
           <w:ilvl w:val="0"/>
-          <w:numId w:val="1009"/>
+          <w:numId w:val="1010"/>
         </w:numPr>
       </w:pPr>
       <w:r>
@@ -1513,37 +1772,31 @@
         <w:pStyle w:val="Compact"/>
         <w:numPr>
           <w:ilvl w:val="0"/>
-          <w:numId w:val="1009"/>
-        </w:numPr>
-      </w:pPr>
-      <w:r>
-        <w:rPr>
-          <w:b/>
-          <w:bCs/>
-        </w:rPr>
-        <w:t xml:space="preserve">Choose the two lowest-barrier challenges as cores.</w:t>
-      </w:r>
-      <w:r>
-        <w:t xml:space="preserve"> </w:t>
-      </w:r>
-      <w:r>
-        <w:t xml:space="preserve">Lead with</w:t>
-      </w:r>
-      <w:r>
-        <w:t xml:space="preserve"> </w:t>
+          <w:numId w:val="1010"/>
+        </w:numPr>
+      </w:pPr>
+      <w:r>
+        <w:rPr>
+          <w:b/>
+          <w:bCs/>
+        </w:rPr>
+        <w:t xml:space="preserve">Adjust difficulty to the room.</w:t>
+      </w:r>
+      <w:r>
+        <w:t xml:space="preserve"> </w:t>
+      </w:r>
+      <w:r>
+        <w:t xml:space="preserve">The set challenges (</w:t>
       </w:r>
       <w:r>
         <w:rPr>
           <w:i/>
           <w:iCs/>
         </w:rPr>
-        <w:t xml:space="preserve">Picture This</w:t>
-      </w:r>
-      <w:r>
-        <w:t xml:space="preserve"> </w:t>
-      </w:r>
-      <w:r>
-        <w:t xml:space="preserve">(visual, immediate payoff) and</w:t>
+        <w:t xml:space="preserve">The Next Step</w:t>
+      </w:r>
+      <w:r>
+        <w:t xml:space="preserve">,</w:t>
       </w:r>
       <w:r>
         <w:t xml:space="preserve"> </w:t>
@@ -1553,13 +1806,10 @@
           <w:i/>
           <w:iCs/>
         </w:rPr>
-        <w:t xml:space="preserve">Plain-Language Gauntlet</w:t>
-      </w:r>
-      <w:r>
-        <w:t xml:space="preserve"> </w:t>
-      </w:r>
-      <w:r>
-        <w:t xml:space="preserve">(no code, universal). Hold</w:t>
+        <w:t xml:space="preserve">This is not a drill</w:t>
+      </w:r>
+      <w:r>
+        <w:t xml:space="preserve">) are meatier and reward a research-capable tool. If the room is AI-shy or short on time, swap in a lower-barrier alternate from Other Challenges —</w:t>
       </w:r>
       <w:r>
         <w:t xml:space="preserve"> </w:t>
@@ -1569,13 +1819,13 @@
           <w:i/>
           <w:iCs/>
         </w:rPr>
-        <w:t xml:space="preserve">Hypothesis Roulette</w:t>
-      </w:r>
-      <w:r>
-        <w:t xml:space="preserve"> </w:t>
-      </w:r>
-      <w:r>
-        <w:t xml:space="preserve">as backup. Defer</w:t>
+        <w:t xml:space="preserve">Picture This</w:t>
+      </w:r>
+      <w:r>
+        <w:t xml:space="preserve"> </w:t>
+      </w:r>
+      <w:r>
+        <w:t xml:space="preserve">(visual, immediate payoff) or</w:t>
       </w:r>
       <w:r>
         <w:t xml:space="preserve"> </w:t>
@@ -1585,13 +1835,13 @@
           <w:i/>
           <w:iCs/>
         </w:rPr>
-        <w:t xml:space="preserve">Rapid Review</w:t>
-      </w:r>
-      <w:r>
-        <w:t xml:space="preserve"> </w:t>
-      </w:r>
-      <w:r>
-        <w:t xml:space="preserve">and</w:t>
+        <w:t xml:space="preserve">Plain-Language Gauntlet</w:t>
+      </w:r>
+      <w:r>
+        <w:t xml:space="preserve"> </w:t>
+      </w:r>
+      <w:r>
+        <w:t xml:space="preserve">(no code, universal), with</w:t>
       </w:r>
       <w:r>
         <w:t xml:space="preserve"> </w:t>
@@ -1601,13 +1851,13 @@
           <w:i/>
           <w:iCs/>
         </w:rPr>
-        <w:t xml:space="preserve">Flash Debate</w:t>
-      </w:r>
-      <w:r>
-        <w:t xml:space="preserve"> </w:t>
-      </w:r>
-      <w:r>
-        <w:t xml:space="preserve">to a longer session — 15 minutes is not enough to manage their citation-hallucination risk responsibly, and that risk can discourage newcomers.</w:t>
+        <w:t xml:space="preserve">Hypothesis Roulette</w:t>
+      </w:r>
+      <w:r>
+        <w:t xml:space="preserve"> </w:t>
+      </w:r>
+      <w:r>
+        <w:t xml:space="preserve">as a lively backup. Both set challenges carry a real hallucination risk (a misdescribed method or a fabricated citation/section), so make verification an explicit step rather than an afterthought.</w:t>
       </w:r>
     </w:p>
     <w:p>
@@ -1615,7 +1865,7 @@
         <w:pStyle w:val="Compact"/>
         <w:numPr>
           <w:ilvl w:val="0"/>
-          <w:numId w:val="1009"/>
+          <w:numId w:val="1010"/>
         </w:numPr>
       </w:pPr>
       <w:r>
@@ -1653,7 +1903,7 @@
         <w:pStyle w:val="Compact"/>
         <w:numPr>
           <w:ilvl w:val="0"/>
-          <w:numId w:val="1009"/>
+          <w:numId w:val="1010"/>
         </w:numPr>
       </w:pPr>
       <w:r>
@@ -1673,7 +1923,7 @@
         <w:t xml:space="preserve"> </w:t>
       </w:r>
       <w:r>
-        <w:t xml:space="preserve">“which AI won, and why”</w:t>
+        <w:t xml:space="preserve">“what did each AI do well, and where did it struggle?”</w:t>
       </w:r>
       <w:r>
         <w:t xml:space="preserve"> </w:t>
@@ -1689,8 +1939,8 @@
         </w:pict>
       </w:r>
     </w:p>
-    <w:bookmarkEnd w:id="17"/>
-    <w:bookmarkStart w:id="18" w:name="the-ethics-moment"/>
+    <w:bookmarkEnd w:id="18"/>
+    <w:bookmarkStart w:id="19" w:name="the-ethics-moment"/>
     <w:p>
       <w:pPr>
         <w:pStyle w:val="Heading2"/>
@@ -1725,8 +1975,8 @@
         <w:t xml:space="preserve">Be especially deliberate around the grant-review and reviewer-finding challenges. Name the live risks explicitly: hallucinated citations and DOIs (every reference is verified at the source, without exception); fabricated statistics presented as plausible numbers; confidentiality and IP (do not paste an unpublished manuscript or an embargoed grant into a tool whose data policy you have not read); and consent for any participant or clinical material. The aim is not to scare the room away from AI — it is to model the judgment that separates a careful scientist from a fast one. That judgment is the curriculum.</w:t>
       </w:r>
     </w:p>
-    <w:bookmarkEnd w:id="18"/>
     <w:bookmarkEnd w:id="19"/>
+    <w:bookmarkEnd w:id="20"/>
     <w:sectPr>
       <w:footnotePr>
         <w:numRestart w:val="eachSect"/>
@@ -2041,6 +2291,9 @@
     <w:abstractNumId w:val="991"/>
   </w:num>
   <w:num w:numId="1005">
+    <w:abstractNumId w:val="991"/>
+  </w:num>
+  <w:num w:numId="1006">
     <w:abstractNumId w:val="99411"/>
     <w:lvlOverride w:ilvl="0">
       <w:startOverride w:val="1"/>
@@ -2070,9 +2323,6 @@
       <w:startOverride w:val="1"/>
     </w:lvlOverride>
   </w:num>
-  <w:num w:numId="1006">
-    <w:abstractNumId w:val="991"/>
-  </w:num>
   <w:num w:numId="1007">
     <w:abstractNumId w:val="991"/>
   </w:num>
@@ -2080,6 +2330,9 @@
     <w:abstractNumId w:val="991"/>
   </w:num>
   <w:num w:numId="1009">
+    <w:abstractNumId w:val="991"/>
+  </w:num>
+  <w:num w:numId="1010">
     <w:abstractNumId w:val="99411"/>
     <w:lvlOverride w:ilvl="0">
       <w:startOverride w:val="1"/>

</xml_diff>